<commit_message>
Round 9 addendum 4: remove embedded figures from Manuscript.docx per PLOS ONE editorial request (ONE-D-26-50896); keep separate TIFFs + legends; update guide/manifest with resubmission steps
</commit_message>
<xml_diff>
--- a/submission_PLOS_ONE/Manuscript.docx
+++ b/submission_PLOS_ONE/Manuscript.docx
@@ -10663,41 +10663,17 @@
     </w:p>
     <w:p>
       <w:pPr>
+        <w:spacing w:before="80" w:after="120"/>
         <w:jc w:val="center"/>
       </w:pPr>
       <w:r>
-        <w:drawing>
-          <wp:inline xmlns:a="http://schemas.openxmlformats.org/drawingml/2006/main" xmlns:pic="http://schemas.openxmlformats.org/drawingml/2006/picture">
-            <wp:extent cx="5486400" cy="2716268"/>
-            <wp:docPr id="1" name="Picture 1"/>
-            <wp:cNvGraphicFramePr>
-              <a:graphicFrameLocks noChangeAspect="1"/>
-            </wp:cNvGraphicFramePr>
-            <a:graphic>
-              <a:graphicData uri="http://schemas.openxmlformats.org/drawingml/2006/picture">
-                <pic:pic>
-                  <pic:nvPicPr>
-                    <pic:cNvPr id="0" name="fig1.png"/>
-                    <pic:cNvPicPr/>
-                  </pic:nvPicPr>
-                  <pic:blipFill>
-                    <a:blip r:embed="rId10"/>
-                    <a:stretch>
-                      <a:fillRect/>
-                    </a:stretch>
-                  </pic:blipFill>
-                  <pic:spPr>
-                    <a:xfrm>
-                      <a:off x="0" y="0"/>
-                      <a:ext cx="5486400" cy="2716268"/>
-                    </a:xfrm>
-                    <a:prstGeom prst="rect"/>
-                  </pic:spPr>
-                </pic:pic>
-              </a:graphicData>
-            </a:graphic>
-          </wp:inline>
-        </w:drawing>
+        <w:rPr>
+          <w:rFonts w:ascii="Times New Roman" w:hAnsi="Times New Roman"/>
+          <w:b w:val="0"/>
+          <w:i/>
+          <w:sz w:val="20"/>
+        </w:rPr>
+        <w:t>[Figure: Figure 1 — provided as separate TIFF file Figure1.tif]</w:t>
       </w:r>
     </w:p>
     <w:p>
@@ -10723,41 +10699,17 @@
     </w:p>
     <w:p>
       <w:pPr>
+        <w:spacing w:before="80" w:after="120"/>
         <w:jc w:val="center"/>
       </w:pPr>
       <w:r>
-        <w:drawing>
-          <wp:inline xmlns:a="http://schemas.openxmlformats.org/drawingml/2006/main" xmlns:pic="http://schemas.openxmlformats.org/drawingml/2006/picture">
-            <wp:extent cx="5486400" cy="4047843"/>
-            <wp:docPr id="2" name="Picture 2"/>
-            <wp:cNvGraphicFramePr>
-              <a:graphicFrameLocks noChangeAspect="1"/>
-            </wp:cNvGraphicFramePr>
-            <a:graphic>
-              <a:graphicData uri="http://schemas.openxmlformats.org/drawingml/2006/picture">
-                <pic:pic>
-                  <pic:nvPicPr>
-                    <pic:cNvPr id="0" name="fig2.png"/>
-                    <pic:cNvPicPr/>
-                  </pic:nvPicPr>
-                  <pic:blipFill>
-                    <a:blip r:embed="rId11"/>
-                    <a:stretch>
-                      <a:fillRect/>
-                    </a:stretch>
-                  </pic:blipFill>
-                  <pic:spPr>
-                    <a:xfrm>
-                      <a:off x="0" y="0"/>
-                      <a:ext cx="5486400" cy="4047843"/>
-                    </a:xfrm>
-                    <a:prstGeom prst="rect"/>
-                  </pic:spPr>
-                </pic:pic>
-              </a:graphicData>
-            </a:graphic>
-          </wp:inline>
-        </w:drawing>
+        <w:rPr>
+          <w:rFonts w:ascii="Times New Roman" w:hAnsi="Times New Roman"/>
+          <w:b w:val="0"/>
+          <w:i/>
+          <w:sz w:val="20"/>
+        </w:rPr>
+        <w:t>[Figure: Figure 2 — provided as separate TIFF file Figure2.tif]</w:t>
       </w:r>
     </w:p>
     <w:p>
@@ -10799,41 +10751,17 @@
     </w:p>
     <w:p>
       <w:pPr>
+        <w:spacing w:before="80" w:after="120"/>
         <w:jc w:val="center"/>
       </w:pPr>
       <w:r>
-        <w:drawing>
-          <wp:inline xmlns:a="http://schemas.openxmlformats.org/drawingml/2006/main" xmlns:pic="http://schemas.openxmlformats.org/drawingml/2006/picture">
-            <wp:extent cx="5486400" cy="4018095"/>
-            <wp:docPr id="3" name="Picture 3"/>
-            <wp:cNvGraphicFramePr>
-              <a:graphicFrameLocks noChangeAspect="1"/>
-            </wp:cNvGraphicFramePr>
-            <a:graphic>
-              <a:graphicData uri="http://schemas.openxmlformats.org/drawingml/2006/picture">
-                <pic:pic>
-                  <pic:nvPicPr>
-                    <pic:cNvPr id="0" name="fig3.png"/>
-                    <pic:cNvPicPr/>
-                  </pic:nvPicPr>
-                  <pic:blipFill>
-                    <a:blip r:embed="rId12"/>
-                    <a:stretch>
-                      <a:fillRect/>
-                    </a:stretch>
-                  </pic:blipFill>
-                  <pic:spPr>
-                    <a:xfrm>
-                      <a:off x="0" y="0"/>
-                      <a:ext cx="5486400" cy="4018095"/>
-                    </a:xfrm>
-                    <a:prstGeom prst="rect"/>
-                  </pic:spPr>
-                </pic:pic>
-              </a:graphicData>
-            </a:graphic>
-          </wp:inline>
-        </w:drawing>
+        <w:rPr>
+          <w:rFonts w:ascii="Times New Roman" w:hAnsi="Times New Roman"/>
+          <w:b w:val="0"/>
+          <w:i/>
+          <w:sz w:val="20"/>
+        </w:rPr>
+        <w:t>[Figure: Figure 3 — provided as separate TIFF file Figure3.tif]</w:t>
       </w:r>
     </w:p>
     <w:p>

</xml_diff>